<commit_message>
Update English and Vietnamese Word CVs with latest content and formatting
</commit_message>
<xml_diff>
--- a/[CV] [HO DUC NHAN] [ACCOUNTING INTERN] - English.docx
+++ b/[CV] [HO DUC NHAN] [ACCOUNTING INTERN] - English.docx
@@ -112,27 +112,7 @@
                 <w:sz w:val="21"/>
                 <w:u w:val="none"/>
               </w:rPr>
-              <w:t xml:space="preserve">hoducnhan240905@gmail.com  |  0338 114 890  |  </w:t>
-            </w:r>
-            <w:r>
-              <w:rPr>
-                <w:rFonts w:ascii="Times New Roman" w:hAnsi="Times New Roman" w:cs="Times New Roman" w:eastAsia="Times New Roman"/>
-                <w:b w:val="0"/>
-                <w:i w:val="0"/>
-                <w:sz w:val="21"/>
-                <w:u w:val="single"/>
-              </w:rPr>
-              <w:t>LinkedIn</w:t>
-            </w:r>
-            <w:r>
-              <w:rPr>
-                <w:rFonts w:ascii="Times New Roman" w:hAnsi="Times New Roman" w:cs="Times New Roman" w:eastAsia="Times New Roman"/>
-                <w:b w:val="0"/>
-                <w:i w:val="0"/>
-                <w:sz w:val="21"/>
-                <w:u w:val="none"/>
-              </w:rPr>
-              <w:t xml:space="preserve">  |  Ho Chi Minh City</w:t>
+              <w:t>hoducnhan240905@gmail.com  |  0338 114 890  |  Ho Chi Minh City</w:t>
             </w:r>
           </w:p>
           <w:p>
@@ -148,7 +128,7 @@
                 <w:sz w:val="20"/>
                 <w:u w:val="none"/>
               </w:rPr>
-              <w:t>Aspiring accounting professional with a strong interest in financial accounting, reporting, and financial controls. I aim to develop practical expertise in financial statement preparation, account reconciliation, transaction analysis, and compliance with accounting standards. Detail-oriented and analytical, I value accuracy, integrity, and reliable financial reporting as key foundations for effective business decision-making.</w:t>
+              <w:t>With a clear career focus on Accounting and a strong interest in financial accounting, financial reporting, and corporate financial controls, I am seeking an Accounting-related position to develop hands-on expertise in financial statement preparation, account reconciliation, line-item ledger operations, and accounting standard compliance. Through my previous internship experience, I have developed a meticulous, detail-oriented work ethic and an analytical mindset. I consistently value accuracy, accounting conservatism, and the integrity of financial statements, establishing key foundations to become a qualified professional in the Accounting, Auditing, and Finance sector.</w:t>
             </w:r>
           </w:p>
         </w:tc>
@@ -187,7 +167,7 @@
           <w:sz w:val="22"/>
           <w:u w:val="none"/>
         </w:rPr>
-        <w:t>Internal Control Intern - Audit and Reconciliation</w:t>
+        <w:t>Internal Control Intern - Audit &amp; Assurance</w:t>
       </w:r>
       <w:r>
         <w:tab/>
@@ -215,7 +195,7 @@
           <w:sz w:val="20"/>
           <w:u w:val="none"/>
         </w:rPr>
-        <w:t>Hesman Group Joint Stock Company | Southern branch (Ho Chi Minh City)</w:t>
+        <w:t>Hesman Group Joint Stock Company | Southern Branch (Ho Chi Minh City)</w:t>
       </w:r>
     </w:p>
     <w:p>
@@ -252,7 +232,7 @@
           <w:sz w:val="20"/>
           <w:u w:val="none"/>
         </w:rPr>
-        <w:t>500+ transaction records per day</w:t>
+        <w:t>500+ daily transactions</w:t>
       </w:r>
       <w:r>
         <w:rPr>
@@ -262,7 +242,7 @@
           <w:sz w:val="20"/>
           <w:u w:val="none"/>
         </w:rPr>
-        <w:t xml:space="preserve"> by cross-checking system data against documents, tracing unusual items and control exceptions, and verifying completeness and accuracy to strengthen financial and operational information reliability.</w:t>
+        <w:t xml:space="preserve"> by cross-checking system data against accounting documents, tracing unusual entries and control exceptions to verify completeness, accuracy, and strengthen the reliability of financial and operational information.</w:t>
       </w:r>
     </w:p>
     <w:p>
@@ -309,7 +289,7 @@
           <w:sz w:val="20"/>
           <w:u w:val="none"/>
         </w:rPr>
-        <w:t>, reconciling system balances with physical stock counts, investigating discrepancies, identifying root causes, and supporting adjustments to improve inventory accuracy.</w:t>
+        <w:t>, reconciling system balances with physical stock counts, investigating variances, identifying root causes, and proposing corrective adjustments to improve inventory data accuracy.</w:t>
       </w:r>
     </w:p>
     <w:p>
@@ -336,7 +316,7 @@
           <w:sz w:val="20"/>
           <w:u w:val="none"/>
         </w:rPr>
-        <w:t xml:space="preserve">Tracked and followed up on </w:t>
+        <w:t xml:space="preserve">Monitored and resolved </w:t>
       </w:r>
       <w:r>
         <w:rPr>
@@ -346,7 +326,7 @@
           <w:sz w:val="20"/>
           <w:u w:val="none"/>
         </w:rPr>
-        <w:t>50+ internal control exceptions per month</w:t>
+        <w:t>50+ compliance violations per month</w:t>
       </w:r>
       <w:r>
         <w:rPr>
@@ -356,7 +336,7 @@
           <w:sz w:val="20"/>
           <w:u w:val="none"/>
         </w:rPr>
-        <w:t>, coordinating with relevant departments to clarify findings, determine corrective actions, monitor remediation progress, and ensure issues were resolved within deadlines.</w:t>
+        <w:t>, collaborating closely with relevant departments to clarify findings, determine corrective actions, track remediation progress, and ensure all issues were conclusively settled before reporting deadlines.</w:t>
       </w:r>
     </w:p>
     <w:p>
@@ -374,7 +354,7 @@
           <w:sz w:val="22"/>
           <w:u w:val="none"/>
         </w:rPr>
-        <w:t>Customer Relationship Intern - Credit Assessment support</w:t>
+        <w:t>Customer Relationship Intern - Credit Assessment Support</w:t>
       </w:r>
       <w:r>
         <w:tab/>
@@ -387,7 +367,7 @@
           <w:sz w:val="20"/>
           <w:u w:val="none"/>
         </w:rPr>
-        <w:t>September 2024 - December 2024</w:t>
+        <w:t>September 2024 – December 2024</w:t>
       </w:r>
     </w:p>
     <w:p>
@@ -402,7 +382,7 @@
           <w:sz w:val="20"/>
           <w:u w:val="none"/>
         </w:rPr>
-        <w:t>Do Thanh transaction office - Vietcombank | Ho Chi Minh City</w:t>
+        <w:t>Do Thanh Transaction Office - Vietcombank | Ho Chi Minh City</w:t>
       </w:r>
     </w:p>
     <w:p>
@@ -429,7 +409,7 @@
           <w:sz w:val="20"/>
           <w:u w:val="none"/>
         </w:rPr>
-        <w:t xml:space="preserve">Received practical experience in </w:t>
+        <w:t xml:space="preserve">Gained practical experience in </w:t>
       </w:r>
       <w:r>
         <w:rPr>
@@ -439,7 +419,7 @@
           <w:sz w:val="20"/>
           <w:u w:val="none"/>
         </w:rPr>
-        <w:t>reviewing financial information, evaluating repayment capacity</w:t>
+        <w:t>financial information verification, repayment capacity assessment</w:t>
       </w:r>
       <w:r>
         <w:rPr>
@@ -449,7 +429,7 @@
           <w:sz w:val="20"/>
           <w:u w:val="none"/>
         </w:rPr>
-        <w:t>, and understanding key factors used to assess individual and corporate borrowers.</w:t>
+        <w:t>, and core criteria used to evaluate individual and corporate loan applicants.</w:t>
       </w:r>
     </w:p>
     <w:p>
@@ -476,7 +456,7 @@
           <w:sz w:val="20"/>
           <w:u w:val="none"/>
         </w:rPr>
-        <w:t xml:space="preserve">Supported the </w:t>
+        <w:t xml:space="preserve">Supported </w:t>
       </w:r>
       <w:r>
         <w:rPr>
@@ -486,7 +466,7 @@
           <w:sz w:val="20"/>
           <w:u w:val="none"/>
         </w:rPr>
-        <w:t>review and completion of customer and credit documentation</w:t>
+        <w:t>reviewing and finalizing customer credit documentation</w:t>
       </w:r>
       <w:r>
         <w:rPr>
@@ -496,7 +476,7 @@
           <w:sz w:val="20"/>
           <w:u w:val="none"/>
         </w:rPr>
-        <w:t>, checking information completeness and following up on outstanding documents before internal processing.</w:t>
+        <w:t>, verifying information completeness and validity, and following up on missing records prior to internal processing.</w:t>
       </w:r>
     </w:p>
     <w:p>
@@ -523,7 +503,7 @@
           <w:sz w:val="20"/>
           <w:u w:val="none"/>
         </w:rPr>
-        <w:t>Monitored the progress of assigned customer files</w:t>
+        <w:t>Closely monitored the progress of assigned customer dossiers</w:t>
       </w:r>
       <w:r>
         <w:rPr>
@@ -533,7 +513,7 @@
           <w:sz w:val="20"/>
           <w:u w:val="none"/>
         </w:rPr>
-        <w:t>, coordinated with Relationship Managers and relevant parties, and helped ensure timely submission for review and approval.</w:t>
+        <w:t>, collaborating with Relationship Managers (RMs) and relevant parties to ensure timely credit appraisal and approval.</w:t>
       </w:r>
     </w:p>
     <w:p>
@@ -560,7 +540,7 @@
           <w:sz w:val="20"/>
           <w:u w:val="none"/>
         </w:rPr>
-        <w:t xml:space="preserve">Received </w:t>
+        <w:t xml:space="preserve">Honored as </w:t>
       </w:r>
       <w:r>
         <w:rPr>
@@ -570,7 +550,7 @@
           <w:sz w:val="20"/>
           <w:u w:val="none"/>
         </w:rPr>
-        <w:t>the Highest Honor of Best Intern in the third quarter of 2024.</w:t>
+        <w:t>Best Intern in the third quarter of 2024.</w:t>
       </w:r>
     </w:p>
     <w:p>
@@ -619,7 +599,7 @@
           <w:sz w:val="20"/>
           <w:u w:val="none"/>
         </w:rPr>
-        <w:t>Graduation in March 2027</w:t>
+        <w:t>Expected Graduation in March 2027</w:t>
       </w:r>
     </w:p>
     <w:p>
@@ -649,7 +629,7 @@
           <w:sz w:val="20"/>
           <w:u w:val="none"/>
         </w:rPr>
-        <w:t>Accounting-related final course grade:</w:t>
+        <w:t>Accounting-related final course grades:</w:t>
       </w:r>
     </w:p>
     <w:p>
@@ -730,7 +710,7 @@
           <w:sz w:val="20"/>
           <w:u w:val="none"/>
         </w:rPr>
-        <w:t>9.0/10 in IFRS</w:t>
+        <w:t>9.0/10 in International Financial Reporting Standards (IFRS)</w:t>
       </w:r>
     </w:p>
     <w:p>
@@ -745,7 +725,7 @@
           <w:sz w:val="20"/>
           <w:u w:val="none"/>
         </w:rPr>
-        <w:t>ACCA certificate</w:t>
+        <w:t>ACCA Certificate</w:t>
       </w:r>
     </w:p>
     <w:p>
@@ -799,7 +779,7 @@
           <w:sz w:val="20"/>
           <w:u w:val="none"/>
         </w:rPr>
-        <w:t>Preparation for Tax/F6 and Financial Reporting/ F7 examination</w:t>
+        <w:t>Preparing for Tax (TX/F6) and Financial Reporting (FR/F7) examinations</w:t>
       </w:r>
     </w:p>
     <w:p>
@@ -814,7 +794,7 @@
           <w:sz w:val="20"/>
           <w:u w:val="none"/>
         </w:rPr>
-        <w:t xml:space="preserve">External courses: </w:t>
+        <w:t xml:space="preserve">External training: </w:t>
       </w:r>
       <w:r>
         <w:rPr>
@@ -842,7 +822,7 @@
           <w:sz w:val="22"/>
           <w:u w:val="none"/>
         </w:rPr>
-        <w:t>ACHIEVEMENTS</w:t>
+        <w:t>ACADEMIC ACHIEVEMENTS</w:t>
       </w:r>
     </w:p>
     <w:p>
@@ -869,7 +849,7 @@
           <w:sz w:val="20"/>
           <w:u w:val="none"/>
         </w:rPr>
-        <w:t xml:space="preserve">Excellent Scholarship </w:t>
+        <w:t xml:space="preserve">Excellent Study Encouragement Scholarship </w:t>
       </w:r>
       <w:r>
         <w:rPr>
@@ -879,7 +859,7 @@
           <w:sz w:val="20"/>
           <w:u w:val="none"/>
         </w:rPr>
-        <w:t>for outstanding performance in Academic and Extracurricular Activities in 3 consecutive years 2024, 2025, 2026</w:t>
+        <w:t>for outstanding academic and extracurricular achievements in 3 consecutive years 2024, 2025, 2026.</w:t>
       </w:r>
     </w:p>
     <w:p>
@@ -906,7 +886,7 @@
           <w:sz w:val="20"/>
           <w:u w:val="none"/>
         </w:rPr>
-        <w:t xml:space="preserve">Selected UEH International Finance Student Representative </w:t>
+        <w:t xml:space="preserve">Student Representative of UEH International Finance </w:t>
       </w:r>
       <w:r>
         <w:rPr>
@@ -916,7 +896,7 @@
           <w:sz w:val="20"/>
           <w:u w:val="none"/>
         </w:rPr>
-        <w:t>for European FIBAA Quality Accreditation Review 2026</w:t>
+        <w:t>participating in European FIBAA Student &amp; Education Quality Accreditation Review 2026.</w:t>
       </w:r>
     </w:p>
     <w:p>
@@ -943,7 +923,7 @@
           <w:sz w:val="20"/>
           <w:u w:val="none"/>
         </w:rPr>
-        <w:t>First prize</w:t>
+        <w:t xml:space="preserve">First Prize (A Award) </w:t>
       </w:r>
       <w:r>
         <w:rPr>
@@ -953,7 +933,7 @@
           <w:sz w:val="20"/>
           <w:u w:val="none"/>
         </w:rPr>
-        <w:t xml:space="preserve"> (A Award) at the 7th Scientific Research Award in Accounting &amp; Auditing (SRAA 2025)</w:t>
+        <w:t>at the 7th Scientific Research Award in Accounting &amp; Auditing (SRAA 2025).</w:t>
       </w:r>
     </w:p>
     <w:p>
@@ -980,7 +960,7 @@
           <w:sz w:val="20"/>
           <w:u w:val="none"/>
         </w:rPr>
-        <w:t>Unmasking Earnings Management in the Digital Era: How Accounting Conservatism Shapes Corporate Behavior in Ho Chi Minh City</w:t>
+        <w:t>Unmasking Earnings Management in the Digital Era: The Role of Accounting Conservatism in Shaping Corporate Behavior in Ho Chi Minh City</w:t>
       </w:r>
     </w:p>
     <w:p>
@@ -1017,7 +997,7 @@
           <w:sz w:val="20"/>
           <w:u w:val="none"/>
         </w:rPr>
-        <w:t>at the 2025 Macroeconomics Challenge</w:t>
+        <w:t>at the 2025 Macroeconomics Challenge (Thử tài Kinh tế Vĩ mô).</w:t>
       </w:r>
     </w:p>
     <w:p>
@@ -1054,7 +1034,7 @@
           <w:sz w:val="20"/>
           <w:u w:val="none"/>
         </w:rPr>
-        <w:t xml:space="preserve">at the 2025 UEH Economics Student Debate Competition </w:t>
+        <w:t>at the 2025 UEH Economics Student Debate Competition.</w:t>
       </w:r>
     </w:p>
     <w:p>
@@ -1091,7 +1071,7 @@
           <w:sz w:val="20"/>
           <w:u w:val="none"/>
         </w:rPr>
-        <w:t>at the 5th E-Banker Banking Academic Competition</w:t>
+        <w:t>at the 5th E-Banker Banking Academic Competition.</w:t>
       </w:r>
     </w:p>
     <w:p>
@@ -1128,7 +1108,7 @@
           <w:sz w:val="20"/>
           <w:u w:val="none"/>
         </w:rPr>
-        <w:t>at the 2024 Microeconomics Challenge</w:t>
+        <w:t>at the 2024 Microeconomics Challenge (Thử tài Kinh tế Vi mô).</w:t>
       </w:r>
     </w:p>
     <w:p>
@@ -1208,7 +1188,7 @@
           <w:sz w:val="20"/>
           <w:u w:val="none"/>
         </w:rPr>
-        <w:t>) – Vietnamese</w:t>
+        <w:t>) – Chinese (Basic communication)</w:t>
       </w:r>
     </w:p>
     <w:p>
@@ -1245,7 +1225,7 @@
           <w:sz w:val="20"/>
           <w:u w:val="none"/>
         </w:rPr>
-        <w:t>Financial Statement Analysis – Financial Reporting Fundamentals – Budgeting &amp; Forecasting Fundamentals</w:t>
+        <w:t>Financial Statement Preparation &amp; Analysis – Budgeting &amp; Forecasting Management</w:t>
       </w:r>
     </w:p>
     <w:p>
@@ -1282,7 +1262,7 @@
           <w:sz w:val="20"/>
           <w:u w:val="none"/>
         </w:rPr>
-        <w:t>Transaction Review – Data Reconciliation – Inventory Audit – Control Testing – Variance Investigation</w:t>
+        <w:t>Transaction Review – Data Reconciliation – Inventory Audit – Control Testing – Variance &amp; Discrepancy Investigation</w:t>
       </w:r>
     </w:p>
     <w:p>
@@ -1558,7 +1538,7 @@
           <w:sz w:val="20"/>
           <w:u w:val="none"/>
         </w:rPr>
-        <w:t>Prompt Engineering – VS code – GitHub – Chat GPT – Claude</w:t>
+        <w:t>Prompt Engineering – VS Code – GitHub – ChatGPT – Claude</w:t>
       </w:r>
     </w:p>
     <w:sectPr>

</xml_diff>